<commit_message>
Clarify PHL5 (fulfillment center) vs HPA1 (distribution center)
</commit_message>
<xml_diff>
--- a/resumes/Matthew_Hardy_Resume.docx
+++ b/resumes/Matthew_Hardy_Resume.docx
@@ -272,7 +272,23 @@
           <w:color w:val="000000"/>
           <w:sz w:val="20"/>
         </w:rPr>
-        <w:t>•  As Bin Meister, owned all cubic-feet capacity for the entire LC3 team — depreciating PHL5 and launching HPA1 with zero critical disruptions.</w:t>
+        <w:t xml:space="preserve">•  As Bin Meister, owned all cubic-feet capacity for the entire LC3 team — </w:t>
+      </w:r>
+      <w:r>
+        <w:rPr>
+          <w:rFonts w:ascii="Calibri" w:hAnsi="Calibri" w:cs="Calibri"/>
+          <w:color w:val="000000"/>
+          <w:sz w:val="20"/>
+        </w:rPr>
+        <w:t>depreciating the PHL5 fulfillment center and launching the HPA1 distribution center</w:t>
+      </w:r>
+      <w:r>
+        <w:rPr>
+          <w:rFonts w:ascii="Calibri" w:hAnsi="Calibri" w:cs="Calibri"/>
+          <w:color w:val="000000"/>
+          <w:sz w:val="20"/>
+        </w:rPr>
+        <w:t xml:space="preserve"> with zero critical disruptions.</w:t>
       </w:r>
     </w:p>
     <w:p>

</xml_diff>

<commit_message>
Title-accurate framing: Data Analyst (doing data-engineering work)
</commit_message>
<xml_diff>
--- a/resumes/Matthew_Hardy_Resume.docx
+++ b/resumes/Matthew_Hardy_Resume.docx
@@ -104,7 +104,15 @@
           <w:color w:val="000000"/>
           <w:sz w:val="20"/>
         </w:rPr>
-        <w:t>Data Engineer with 3+ years at Amazon who designs serverless AWS data platforms (Glue, Lambda, Redshift, S3, CloudFront, EventBridge) serving 7 distribution centers. I build ETL pipelines, 35+ production SQL queries, and full-stack apps in Python &amp; TypeScript. Owner of a production AWS account that passed formal security review; founder of an AI-powered SaaS. AWS Cloud Engineering, Cybersecurity &amp; Software Development certified.</w:t>
+        <w:t>Data Analyst at Amazon (3+ years) doing data-engineering work — I design serverless AWS data platforms</w:t>
+      </w:r>
+      <w:r>
+        <w:rPr>
+          <w:rFonts w:ascii="Calibri" w:hAnsi="Calibri" w:cs="Calibri"/>
+          <w:color w:val="000000"/>
+          <w:sz w:val="20"/>
+        </w:rPr>
+        <w:t xml:space="preserve"> (Glue, Lambda, Redshift, S3, CloudFront, EventBridge) serving 7 distribution centers. I build ETL pipelines, 35+ production SQL queries, and full-stack apps in Python &amp; TypeScript. Owner of a production AWS account that passed formal security review; founder of an AI-powered SaaS. AWS Cloud Engineering, Cybersecurity &amp; Software Development certified.</w:t>
       </w:r>
     </w:p>
     <w:p>
@@ -154,7 +162,7 @@
           <w:color w:val="000000"/>
           <w:sz w:val="21"/>
         </w:rPr>
-        <w:t>Amazon — Data Engineer / Data Analyst (also Bin Meister)</w:t>
+        <w:t>Amazon — Data Analyst (also Bin Meister)</w:t>
       </w:r>
       <w:r>
         <w:rPr>

</xml_diff>

<commit_message>
Rebrand independent work as Hardy Family Fund + reorder Snagwire after Amazon
</commit_message>
<xml_diff>
--- a/resumes/Matthew_Hardy_Resume.docx
+++ b/resumes/Matthew_Hardy_Resume.docx
@@ -104,15 +104,7 @@
           <w:color w:val="000000"/>
           <w:sz w:val="20"/>
         </w:rPr>
-        <w:t>Data Analyst at Amazon (3+ years) doing data-engineering work — I design serverless AWS data platforms</w:t>
-      </w:r>
-      <w:r>
-        <w:rPr>
-          <w:rFonts w:ascii="Calibri" w:hAnsi="Calibri" w:cs="Calibri"/>
-          <w:color w:val="000000"/>
-          <w:sz w:val="20"/>
-        </w:rPr>
-        <w:t xml:space="preserve"> (Glue, Lambda, Redshift, S3, CloudFront, EventBridge) serving 7 distribution centers. I build ETL pipelines, 35+ production SQL queries, and full-stack apps in Python &amp; TypeScript. Owner of a production AWS account that passed formal security review; founder of an AI-powered SaaS. AWS Cloud Engineering, Cybersecurity &amp; Software Development certified.</w:t>
+        <w:t>Data Analyst at Amazon (3+ years) doing data-engineering work, with 15+ years across analytics, automation, and security. I design serverless AWS data platforms (Glue, Lambda, Redshift, S3, CloudFront, EventBridge) serving 7 distribution centers, build ETL pipelines and 35+ production SQL queries, and ship full-stack apps in Python &amp; TypeScript. Owner of a production AWS account that passed formal security review; founder of an AI-powered SaaS. AWS Cloud Engineering, Cybersecurity &amp; Software Development certified.</w:t>
       </w:r>
     </w:p>
     <w:p>
@@ -280,23 +272,7 @@
           <w:color w:val="000000"/>
           <w:sz w:val="20"/>
         </w:rPr>
-        <w:t xml:space="preserve">•  As Bin Meister, owned all cubic-feet capacity for the entire LC3 team — </w:t>
-      </w:r>
-      <w:r>
-        <w:rPr>
-          <w:rFonts w:ascii="Calibri" w:hAnsi="Calibri" w:cs="Calibri"/>
-          <w:color w:val="000000"/>
-          <w:sz w:val="20"/>
-        </w:rPr>
-        <w:t>depreciating the PHL5 fulfillment center and launching the HPA1 distribution center</w:t>
-      </w:r>
-      <w:r>
-        <w:rPr>
-          <w:rFonts w:ascii="Calibri" w:hAnsi="Calibri" w:cs="Calibri"/>
-          <w:color w:val="000000"/>
-          <w:sz w:val="20"/>
-        </w:rPr>
-        <w:t xml:space="preserve"> with zero critical disruptions.</w:t>
+        <w:t>•  As Bin Meister, owned all cubic-feet capacity for the entire LC3 team — depreciating the PHL5 fulfillment center and launching the HPA1 distribution center with zero critical disruptions.</w:t>
       </w:r>
     </w:p>
     <w:p>
@@ -319,7 +295,7 @@
           <w:color w:val="000000"/>
           <w:sz w:val="21"/>
         </w:rPr>
-        <w:t>Snagwire — Founder &amp; Engineer</w:t>
+        <w:t>Amazon — Supervisor / Problem Solver</w:t>
       </w:r>
       <w:r>
         <w:rPr>
@@ -337,7 +313,7 @@
           <w:color w:val="595959"/>
           <w:sz w:val="19"/>
         </w:rPr>
-        <w:t>2025 – Present</w:t>
+        <w:t>Nov 2022 – Aug 2024</w:t>
       </w:r>
     </w:p>
     <w:p>
@@ -357,7 +333,7 @@
           <w:color w:val="000000"/>
           <w:sz w:val="20"/>
         </w:rPr>
-        <w:t>•  Founded and operate an AI-powered SaaS — full-stack on Next.js, TypeScript &amp; Supabase with 10 autonomous AI agents (Gemini) aggregating real-time pricing across Amazon, Walmart, eBay &amp; Best Buy; own payments (Lemon Squeezy/Stripe), Twilio, and Vercel CI/CD.</w:t>
+        <w:t>•  Built automation that cut a 1-hour manual process to 10 minutes (83% gain), adopted team-wide; served as SME managing AWS programs (FC Research, GraVis, Eagle Eye).</w:t>
       </w:r>
     </w:p>
     <w:p>
@@ -380,7 +356,7 @@
           <w:color w:val="000000"/>
           <w:sz w:val="21"/>
         </w:rPr>
-        <w:t>Amazon — Supervisor / Problem Solver</w:t>
+        <w:t>Snagwire — Founder &amp; Engineer</w:t>
       </w:r>
       <w:r>
         <w:rPr>
@@ -398,7 +374,7 @@
           <w:color w:val="595959"/>
           <w:sz w:val="19"/>
         </w:rPr>
-        <w:t>Nov 2022 – Aug 2024</w:t>
+        <w:t>2025 – Present</w:t>
       </w:r>
     </w:p>
     <w:p>
@@ -418,7 +394,68 @@
           <w:color w:val="000000"/>
           <w:sz w:val="20"/>
         </w:rPr>
-        <w:t>•  Built automation that cut a 1-hour manual process to 10 minutes (83% gain), adopted team-wide; served as SME managing AWS programs (FC Research, GraVis, Eagle Eye).</w:t>
+        <w:t>•  Founded and operate an AI-powered SaaS — full-stack on Next.js, TypeScript &amp; Supabase with 10 autonomous AI agents (Gemini) aggregating real-time pricing across Amazon, Walmart, eBay &amp; Best Buy; own payments (Lemon Squeezy/Stripe), Twilio, and Vercel CI/CD.</w:t>
+      </w:r>
+    </w:p>
+    <w:p>
+      <w:pPr>
+        <w:tabs>
+          <w:tab w:val="right" w:pos="10080"/>
+        </w:tabs>
+        <w:spacing w:before="80" w:after="20" w:line="240" w:lineRule="auto"/>
+        <w:rPr>
+          <w:rFonts w:ascii="Calibri" w:hAnsi="Calibri" w:cs="Calibri"/>
+          <w:i/>
+          <w:color w:val="595959"/>
+          <w:sz w:val="19"/>
+        </w:rPr>
+      </w:pPr>
+      <w:r>
+        <w:rPr>
+          <w:rFonts w:ascii="Calibri" w:hAnsi="Calibri" w:cs="Calibri"/>
+          <w:b/>
+          <w:color w:val="000000"/>
+          <w:sz w:val="21"/>
+        </w:rPr>
+        <w:t>Hardy Family Fund — Portfolio Manager &amp; Quantitative Developer</w:t>
+      </w:r>
+      <w:r>
+        <w:rPr>
+          <w:rFonts w:ascii="Calibri" w:hAnsi="Calibri" w:cs="Calibri"/>
+          <w:b/>
+          <w:color w:val="000000"/>
+          <w:sz w:val="21"/>
+        </w:rPr>
+        <w:tab/>
+      </w:r>
+      <w:r>
+        <w:rPr>
+          <w:rFonts w:ascii="Calibri" w:hAnsi="Calibri" w:cs="Calibri"/>
+          <w:i/>
+          <w:color w:val="595959"/>
+          <w:sz w:val="19"/>
+        </w:rPr>
+        <w:t>Jun 2010 – Present</w:t>
+      </w:r>
+    </w:p>
+    <w:p>
+      <w:pPr>
+        <w:spacing w:after="40" w:line="240" w:lineRule="auto"/>
+        <w:ind w:left="260" w:hanging="260"/>
+        <w:jc w:val="both"/>
+        <w:rPr>
+          <w:rFonts w:ascii="Calibri" w:hAnsi="Calibri" w:cs="Calibri"/>
+          <w:color w:val="000000"/>
+          <w:sz w:val="20"/>
+        </w:rPr>
+      </w:pPr>
+      <w:r>
+        <w:rPr>
+          <w:rFonts w:ascii="Calibri" w:hAnsi="Calibri" w:cs="Calibri"/>
+          <w:color w:val="000000"/>
+          <w:sz w:val="20"/>
+        </w:rPr>
+        <w:t>•  Built proprietary financial-analysis tools (thinkScript) and automated real-time news collection via APIs for 50+ companies; applied technical analysis (Regression, Wyckoff) to systematic trading strategies.</w:t>
       </w:r>
     </w:p>
     <w:p>
@@ -589,7 +626,7 @@
           <w:color w:val="000000"/>
           <w:sz w:val="20"/>
         </w:rPr>
-        <w:t>Next.js, Supabase, Flask, Chart.js, Plotly, Selenium, Git, Tableau, Power BI</w:t>
+        <w:t>Next.js, Supabase, Flask, Chart.js, Plotly, Selenium, Git, Tableau, Power BI, Stripe/Lemon Squeezy</w:t>
       </w:r>
     </w:p>
     <w:p>
@@ -616,7 +653,7 @@
           <w:color w:val="000000"/>
           <w:sz w:val="20"/>
         </w:rPr>
-        <w:t>Cybersecurity, ASR/Shepard, AWS Detective, CSPM, Risk Management</w:t>
+        <w:t>Cybersecurity, ASR/Shepard, AWS Detective, CSPM, Risk Management, ACMS, STEM, BinConf</w:t>
       </w:r>
     </w:p>
     <w:p>

</xml_diff>

<commit_message>
Remove camera emoji from screenshot buttons, add MG pick/stow screenshots, software-dev resume update
</commit_message>
<xml_diff>
--- a/resumes/Matthew_Hardy_Resume.docx
+++ b/resumes/Matthew_Hardy_Resume.docx
@@ -104,7 +104,23 @@
           <w:color w:val="000000"/>
           <w:sz w:val="20"/>
         </w:rPr>
-        <w:t>Data Analyst at Amazon (3+ years) doing data-engineering work, with 15+ years across analytics, automation, and security. I design serverless AWS data platforms (Glue, Lambda, Redshift, S3, CloudFront, EventBridge) serving 7 distribution centers, build ETL pipelines and 35+ production SQL queries, and ship full-stack apps in Python &amp; TypeScript. Owner of a production AWS account that passed formal security review; founder of an AI-powered SaaS. AWS Cloud Engineering, Cybersecurity &amp; Software Development certified.</w:t>
+        <w:t xml:space="preserve">Data Analyst at Amazon (3+ years) doing data-engineering work, with </w:t>
+      </w:r>
+      <w:r>
+        <w:rPr>
+          <w:rFonts w:ascii="Calibri" w:hAnsi="Calibri" w:cs="Calibri"/>
+          <w:color w:val="000000"/>
+          <w:sz w:val="20"/>
+        </w:rPr>
+        <w:t>15+ years across analytics, automation, software development, and security.</w:t>
+      </w:r>
+      <w:r>
+        <w:rPr>
+          <w:rFonts w:ascii="Calibri" w:hAnsi="Calibri" w:cs="Calibri"/>
+          <w:color w:val="000000"/>
+          <w:sz w:val="20"/>
+        </w:rPr>
+        <w:t xml:space="preserve"> I design serverless AWS data platforms (Glue, Lambda, Redshift, S3, CloudFront, EventBridge) serving 7 distribution centers, build ETL pipelines and 35+ production SQL queries, and ship full-stack apps in Python &amp; TypeScript. Owner of a production AWS account that passed formal security review; founder of an AI-powered SaaS. AWS Cloud Engineering, Cybersecurity &amp; Software Development certified.</w:t>
       </w:r>
     </w:p>
     <w:p>

</xml_diff>

<commit_message>
Standardize Amazon tenure to '3+ years' and clarify Data Analyst since 2024 (site + both resumes)
</commit_message>
<xml_diff>
--- a/resumes/Matthew_Hardy_Resume.docx
+++ b/resumes/Matthew_Hardy_Resume.docx
@@ -104,7 +104,15 @@
           <w:color w:val="000000"/>
           <w:sz w:val="20"/>
         </w:rPr>
-        <w:t xml:space="preserve">Data Analyst at Amazon (3+ years) doing data-engineering work, with </w:t>
+        <w:t>At Amazon 3+ years (Data Analyst since 2024) doing data-engineering work,</w:t>
+      </w:r>
+      <w:r>
+        <w:rPr>
+          <w:rFonts w:ascii="Calibri" w:hAnsi="Calibri" w:cs="Calibri"/>
+          <w:color w:val="000000"/>
+          <w:sz w:val="20"/>
+        </w:rPr>
+        <w:t xml:space="preserve"> with </w:t>
       </w:r>
       <w:r>
         <w:rPr>

</xml_diff>